<commit_message>
Update DCF valuation: corrected D&A treatment, share count, and FY2022 presentation
</commit_message>
<xml_diff>
--- a/model/TGT_Investment_Thesis_Memo.docx
+++ b/model/TGT_Investment_Thesis_Memo.docx
@@ -113,7 +113,7 @@
                 <w:color w:val="17365D"/>
                 <w:sz w:val="26"/>
               </w:rPr>
-              <w:t>$99.53</w:t>
+              <w:t>$117.78</w:t>
             </w:r>
           </w:p>
         </w:tc>
@@ -149,7 +149,7 @@
                 <w:color w:val="17365D"/>
                 <w:sz w:val="26"/>
               </w:rPr>
-              <w:t>$115.47</w:t>
+              <w:t>$126.76</w:t>
             </w:r>
           </w:p>
         </w:tc>
@@ -185,7 +185,7 @@
                 <w:color w:val="17365D"/>
                 <w:sz w:val="26"/>
               </w:rPr>
-              <w:t>8.27%</w:t>
+              <w:t>8.29%</w:t>
             </w:r>
           </w:p>
         </w:tc>
@@ -201,7 +201,7 @@
     </w:p>
     <w:p>
       <w:r>
-        <w:t>Target’s base-case intrinsic value is $99.53 per share, approximately 23.6% below the supplied July 2, 2026 market price. An 8.0x exit-multiple cross-check produces $115.47 per share, also below market. The valuation reflects a gradual sales recovery and modest operating leverage, but not enough improvement to support the current price under conservative terminal assumptions.</w:t>
+        <w:t>Target’s base-case intrinsic value is $117.78 per share, approximately 9.5% below the July 2, 2026 market price. An 8.0x exit-multiple cross-check produces $126.76 per share, also below market. The valuation reflects a gradual sales recovery and modest operating leverage, but not enough improvement to support the current price under conservative terminal assumptions.</w:t>
       </w:r>
     </w:p>
     <w:p>
@@ -254,7 +254,7 @@
         <w:t xml:space="preserve">• Cash generation: </w:t>
       </w:r>
       <w:r>
-        <w:t>UFCF normalizes after the FY2026 working-capital reset and reaches approximately $3.9 billion in FY2030E.</w:t>
+        <w:t>UFCF normalizes after the FY2026 working-capital reset and reaches approximately $4.5 billion in FY2030E.</w:t>
       </w:r>
     </w:p>
     <w:p>
@@ -282,7 +282,10 @@
     </w:p>
     <w:p>
       <w:r>
-        <w:t>The 8.27% WACC uses CAPM and a forward-looking 5.3% marginal pre-tax borrowing cost rather than Target’s lower legacy effective rate. The primary terminal value uses 2.0% perpetual growth, consistent with long-run inflation/GDP expectations. Sensitivity spans 7.0%–9.5% WACC and 1.0%–3.0% growth, with independently auditable formulas in every cell.</w:t>
+        <w:t>The 8.29% WACC uses CAPM and a forward-looking 5.34% marginal pre-tax borrowing cost rather than Target’s lower legacy effective rate. The primary terminal value uses 2.0% perpetual growth, consistent with long-run inflation/GDP expectations. Sensitivity spans 7.0%–9.5% WACC and 1.0%–3.0% growth, with independently auditable formulas in every cell.</w:t>
+      </w:r>
+      <w:r>
+        <w:t xml:space="preserve"> Full D&amp;A is forecast separately at 3.0% of revenue and is used in UFCF, PP&amp;E, and EBITDA calculations; the income-statement D&amp;A line excludes depreciation embedded in cost of sales.</w:t>
       </w:r>
     </w:p>
     <w:p>
@@ -423,6 +426,7 @@
     </w:p>
     <w:sectPr>
       <w:footerReference w:type="default" r:id="rId9"/>
+      <w:headerReference w:type="default" r:id="rId10"/>
       <w:pgSz w:w="12240" w:h="15840"/>
       <w:pgMar w:top="936" w:right="1080" w:bottom="936" w:left="1080" w:header="432" w:footer="432" w:gutter="0"/>
       <w:cols w:space="720"/>
@@ -449,6 +453,16 @@
     </w:r>
   </w:p>
 </w:ftr>
+</file>
+
+<file path=word/header1.xml><?xml version="1.0" encoding="utf-8"?>
+<w:hdr xmlns:m="http://schemas.openxmlformats.org/officeDocument/2006/math" xmlns:mc="http://schemas.openxmlformats.org/markup-compatibility/2006" xmlns:mo="http://schemas.microsoft.com/office/mac/office/2008/main" xmlns:mv="urn:schemas-microsoft-com:mac:vml" xmlns:o="urn:schemas-microsoft-com:office:office" xmlns:r="http://schemas.openxmlformats.org/officeDocument/2006/relationships" xmlns:v="urn:schemas-microsoft-com:vml" xmlns:w10="urn:schemas-microsoft-com:office:word" xmlns:w14="http://schemas.microsoft.com/office/word/2010/wordml" xmlns:w="http://schemas.openxmlformats.org/wordprocessingml/2006/main" xmlns:wne="http://schemas.microsoft.com/office/word/2006/wordml" xmlns:wp14="http://schemas.microsoft.com/office/word/2010/wordprocessingDrawing" xmlns:wp="http://schemas.openxmlformats.org/drawingml/2006/wordprocessingDrawing" xmlns:wpc="http://schemas.microsoft.com/office/word/2010/wordprocessingCanvas" xmlns:wpg="http://schemas.microsoft.com/office/word/2010/wordprocessingGroup" xmlns:wpi="http://schemas.microsoft.com/office/word/2010/wordprocessingInk" xmlns:wps="http://schemas.microsoft.com/office/word/2010/wordprocessingShape" mc:Ignorable="w14 wp14">
+  <w:p>
+    <w:pPr>
+      <w:pStyle w:val="Header"/>
+    </w:pPr>
+  </w:p>
+</w:hdr>
 </file>
 
 <file path=word/numbering.xml><?xml version="1.0" encoding="utf-8"?>

</xml_diff>